<commit_message>
Pin integration references and rename receptionist Ryan
</commit_message>
<xml_diff>
--- a/ChinookIT_AI_Receptionist_Codex_Spec.docx
+++ b/ChinookIT_AI_Receptionist_Codex_Spec.docx
@@ -1663,7 +1663,7 @@
         <w:t xml:space="preserve">“</w:t>
       </w:r>
       <w:r>
-        <w:t xml:space="preserve">Alex</w:t>
+        <w:t xml:space="preserve">Ryan</w:t>
       </w:r>
       <w:r>
         <w:t xml:space="preserve">”</w:t>
@@ -1690,7 +1690,7 @@
         <w:t xml:space="preserve">“</w:t>
       </w:r>
       <w:r>
-        <w:t xml:space="preserve">Thanks for calling ChinookIT. I’m Alex, the AI support assistant. I can help create a support ticket. Please avoid sharing patient information or passwords. What clinic are you calling from?</w:t>
+        <w:t xml:space="preserve">Thanks for calling ChinookIT. I’m Ryan, the AI support assistant. I can help create a support ticket. Please avoid sharing patient information or passwords. What clinic are you calling from?</w:t>
       </w:r>
       <w:r>
         <w:t xml:space="preserve">”</w:t>

</xml_diff>